<commit_message>
fix: update portfolio link to new vercel URL in resume
</commit_message>
<xml_diff>
--- a/public/Amit_Singh_Resume.docx
+++ b/public/Amit_Singh_Resume.docx
@@ -104,53 +104,32 @@
         </w:rPr>
         <w:t xml:space="preserve">Technology) </w:t>
       </w:r>
-      <w:hyperlink r:id="rId5">
+      <w:hyperlink r:id="rId5" w:history="1">
         <w:r>
           <w:rPr>
-            <w:spacing w:val="-2"/>
-            <w:u w:val="single"/>
+            <w:rStyle w:val="Hyperlink"/>
           </w:rPr>
           <w:t>LinkedIn</w:t>
         </w:r>
       </w:hyperlink>
       <w:r>
-        <w:t xml:space="preserve">  </w:t>
-      </w:r>
-      <w:r>
-        <w:rPr>
-          <w:rFonts w:ascii="Times New Roman" w:hAnsi="Times New Roman"/>
-          <w:i/>
-          <w:spacing w:val="-10"/>
-        </w:rPr>
-        <w:t>|</w:t>
-      </w:r>
-      <w:r>
-        <w:rPr>
-          <w:rFonts w:ascii="Times New Roman" w:hAnsi="Times New Roman"/>
-          <w:i/>
-        </w:rPr>
-        <w:t xml:space="preserve">  </w:t>
-      </w:r>
-      <w:hyperlink r:id="rId6">
+        <w:t xml:space="preserve">  |  </w:t>
+      </w:r>
+      <w:hyperlink r:id="rId6" w:history="1">
         <w:r>
           <w:rPr>
-            <w:spacing w:val="-2"/>
-            <w:u w:val="single"/>
+            <w:rStyle w:val="Hyperlink"/>
           </w:rPr>
           <w:t>Portfolio</w:t>
         </w:r>
       </w:hyperlink>
       <w:r>
-        <w:t xml:space="preserve">  | </w:t>
-      </w:r>
-      <w:r>
-        <w:t xml:space="preserve"> </w:t>
+        <w:t xml:space="preserve">  |  </w:t>
       </w:r>
       <w:hyperlink r:id="rId7" w:history="1">
         <w:r>
           <w:rPr>
             <w:rStyle w:val="Hyperlink"/>
-            <w:color w:val="auto"/>
           </w:rPr>
           <w:t>GitHub</w:t>
         </w:r>

</xml_diff>